<commit_message>
Implemented skeletons of everything
</commit_message>
<xml_diff>
--- a/hw2/documentation/comp_graphics_hw2.docx
+++ b/hw2/documentation/comp_graphics_hw2.docx
@@ -109,13 +109,7 @@
         <w:ind w:firstLine="720"/>
       </w:pPr>
       <w:r>
-        <w:t xml:space="preserve">The goal of this programming assignment was to design and implement an interactive Pac-Man style simulation using C++ and OpenGL. The program required object-oriented </w:t>
-      </w:r>
-      <w:r>
-        <w:t>programming and design</w:t>
-      </w:r>
-      <w:r>
-        <w:t>, rendering 2D shapes using OpenGL primitives, and structuring the system using the Model-View-Controller (MVC) architecture.</w:t>
+        <w:t>The goal of this programming assignment was to design and implement an interactive Pac-Man style simulation using C++ and OpenGL. The program required object-oriented programming and design, rendering 2D shapes using OpenGL primitives, and structuring the system using the Model-View-Controller (MVC) architecture.</w:t>
       </w:r>
       <w:r>
         <w:t xml:space="preserve"> </w:t>
@@ -477,13 +471,8 @@
         </w:rPr>
       </w:pPr>
       <w:r>
-        <w:rPr>
-          <w:noProof/>
-        </w:rPr>
-      </w:r>
-      <w:r>
-        <w:pict w14:anchorId="66A8EDBF">
-          <v:rect id="Horizontal Line 1" o:spid="_x0000_s1034" style="width:6in;height:.1pt;visibility:visible;mso-wrap-style:square;mso-left-percent:-10001;mso-top-percent:-10001;mso-position-horizontal:absolute;mso-position-horizontal-relative:char;mso-position-vertical:absolute;mso-position-vertical-relative:line;mso-left-percent:-10001;mso-top-percent:-10001;v-text-anchor:top" o:gfxdata="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" filled="f">
+        <w:pict w14:anchorId="7EA2A2FD">
+          <v:rect id="Horizontal Line 1" o:spid="_x0000_s1034" alt="" style="width:6in;height:.1pt;visibility:visible;mso-wrap-style:square;mso-width-percent:0;mso-height-percent:0;mso-left-percent:-10001;mso-top-percent:-10001;mso-position-horizontal:absolute;mso-position-horizontal-relative:char;mso-position-vertical:absolute;mso-position-vertical-relative:line;mso-width-percent:0;mso-height-percent:0;mso-left-percent:-10001;mso-top-percent:-10001;v-text-anchor:top" filled="f">
             <o:lock v:ext="edit" rotation="t" aspectratio="t" verticies="t" text="t" shapetype="t"/>
             <w10:anchorlock/>
           </v:rect>
@@ -612,23 +601,30 @@
         <w:rPr>
           <w:rFonts w:ascii="Times New Roman" w:eastAsia="Times New Roman" w:hAnsi="Times New Roman" w:cs="Times New Roman"/>
         </w:rPr>
-        <w:t>No complete systems were auto-generated and pasted without understanding. All implementation decisions were integrated and modified manually.</w:t>
-      </w:r>
-    </w:p>
-    <w:p>
-      <w:pPr>
-        <w:rPr>
-          <w:rFonts w:ascii="Times New Roman" w:eastAsia="Times New Roman" w:hAnsi="Times New Roman" w:cs="Times New Roman"/>
-        </w:rPr>
-      </w:pPr>
-      <w:r>
-        <w:rPr>
-          <w:noProof/>
-        </w:rPr>
-      </w:r>
-      <w:r>
-        <w:pict w14:anchorId="6ACF7317">
-          <v:rect id="Horizontal Line 2" o:spid="_x0000_s1033" style="width:6in;height:.1pt;visibility:visible;mso-wrap-style:square;mso-left-percent:-10001;mso-top-percent:-10001;mso-position-horizontal:absolute;mso-position-horizontal-relative:char;mso-position-vertical:absolute;mso-position-vertical-relative:line;mso-left-percent:-10001;mso-top-percent:-10001;v-text-anchor:top" o:gfxdata="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" filled="f">
+        <w:t xml:space="preserve">No complete systems were </w:t>
+      </w:r>
+      <w:r>
+        <w:rPr>
+          <w:rFonts w:ascii="Times New Roman" w:eastAsia="Times New Roman" w:hAnsi="Times New Roman" w:cs="Times New Roman"/>
+        </w:rPr>
+        <w:t>auto generated</w:t>
+      </w:r>
+      <w:r>
+        <w:rPr>
+          <w:rFonts w:ascii="Times New Roman" w:eastAsia="Times New Roman" w:hAnsi="Times New Roman" w:cs="Times New Roman"/>
+        </w:rPr>
+        <w:t xml:space="preserve"> and pasted without understanding. All implementation decisions were integrated and modified manually.</w:t>
+      </w:r>
+    </w:p>
+    <w:p>
+      <w:pPr>
+        <w:rPr>
+          <w:rFonts w:ascii="Times New Roman" w:eastAsia="Times New Roman" w:hAnsi="Times New Roman" w:cs="Times New Roman"/>
+        </w:rPr>
+      </w:pPr>
+      <w:r>
+        <w:pict w14:anchorId="29C68F45">
+          <v:rect id="Horizontal Line 2" o:spid="_x0000_s1033" alt="" style="width:6in;height:.1pt;visibility:visible;mso-wrap-style:square;mso-width-percent:0;mso-height-percent:0;mso-left-percent:-10001;mso-top-percent:-10001;mso-position-horizontal:absolute;mso-position-horizontal-relative:char;mso-position-vertical:absolute;mso-position-vertical-relative:line;mso-width-percent:0;mso-height-percent:0;mso-left-percent:-10001;mso-top-percent:-10001;v-text-anchor:top" filled="f">
             <o:lock v:ext="edit" rotation="t" aspectratio="t" verticies="t" text="t" shapetype="t"/>
             <w10:anchorlock/>
           </v:rect>
@@ -671,8 +667,8 @@
           <w:rFonts w:ascii="Times New Roman" w:eastAsia="Times New Roman" w:hAnsi="Times New Roman" w:cs="Times New Roman"/>
           <w:noProof/>
         </w:rPr>
-        <w:pict w14:anchorId="42C58359">
-          <v:rect id="_x0000_i1036" alt="" style="width:431.95pt;height:.05pt;mso-width-percent:0;mso-height-percent:0;mso-width-percent:0;mso-height-percent:0" o:hrpct="923" o:hralign="center" o:hrstd="t" o:hr="t" fillcolor="#a0a0a0" stroked="f"/>
+        <w:pict w14:anchorId="3F65E56E">
+          <v:rect id="_x0000_i1036" alt="" style="width:398.75pt;height:.05pt;mso-width-percent:0;mso-height-percent:0;mso-width-percent:0;mso-height-percent:0" o:hrpct="852" o:hralign="center" o:hrstd="t" o:hr="t" fillcolor="#a0a0a0" stroked="f"/>
         </w:pict>
       </w:r>
     </w:p>
@@ -936,8 +932,8 @@
           <w:rFonts w:ascii="Times New Roman" w:eastAsia="Times New Roman" w:hAnsi="Times New Roman" w:cs="Times New Roman"/>
           <w:noProof/>
         </w:rPr>
-        <w:pict w14:anchorId="190CB791">
-          <v:rect id="_x0000_i1035" alt="" style="width:431.95pt;height:.05pt;mso-width-percent:0;mso-height-percent:0;mso-width-percent:0;mso-height-percent:0" o:hrpct="923" o:hralign="center" o:hrstd="t" o:hr="t" fillcolor="#a0a0a0" stroked="f"/>
+        <w:pict w14:anchorId="2C3ED77A">
+          <v:rect id="_x0000_i1035" alt="" style="width:398.75pt;height:.05pt;mso-width-percent:0;mso-height-percent:0;mso-width-percent:0;mso-height-percent:0" o:hrpct="852" o:hralign="center" o:hrstd="t" o:hr="t" fillcolor="#a0a0a0" stroked="f"/>
         </w:pict>
       </w:r>
     </w:p>
@@ -1190,8 +1186,8 @@
           <w:rFonts w:ascii="Times New Roman" w:eastAsia="Times New Roman" w:hAnsi="Times New Roman" w:cs="Times New Roman"/>
           <w:noProof/>
         </w:rPr>
-        <w:pict w14:anchorId="507D2B04">
-          <v:rect id="_x0000_i1034" alt="" style="width:431.95pt;height:.05pt;mso-width-percent:0;mso-height-percent:0;mso-width-percent:0;mso-height-percent:0" o:hrpct="923" o:hralign="center" o:hrstd="t" o:hr="t" fillcolor="#a0a0a0" stroked="f"/>
+        <w:pict w14:anchorId="6034D302">
+          <v:rect id="_x0000_i1034" alt="" style="width:398.75pt;height:.05pt;mso-width-percent:0;mso-height-percent:0;mso-width-percent:0;mso-height-percent:0" o:hrpct="852" o:hralign="center" o:hrstd="t" o:hr="t" fillcolor="#a0a0a0" stroked="f"/>
         </w:pict>
       </w:r>
     </w:p>
@@ -1422,8 +1418,8 @@
           <w:rFonts w:ascii="Times New Roman" w:eastAsia="Times New Roman" w:hAnsi="Times New Roman" w:cs="Times New Roman"/>
           <w:noProof/>
         </w:rPr>
-        <w:pict w14:anchorId="4FA08F00">
-          <v:rect id="_x0000_i1033" alt="" style="width:431.95pt;height:.05pt;mso-width-percent:0;mso-height-percent:0;mso-width-percent:0;mso-height-percent:0" o:hrpct="923" o:hralign="center" o:hrstd="t" o:hr="t" fillcolor="#a0a0a0" stroked="f"/>
+        <w:pict w14:anchorId="4CC0EE06">
+          <v:rect id="_x0000_i1033" alt="" style="width:398.75pt;height:.05pt;mso-width-percent:0;mso-height-percent:0;mso-width-percent:0;mso-height-percent:0" o:hrpct="852" o:hralign="center" o:hrstd="t" o:hr="t" fillcolor="#a0a0a0" stroked="f"/>
         </w:pict>
       </w:r>
     </w:p>
@@ -1625,8 +1621,8 @@
           <w:rFonts w:ascii="Times New Roman" w:eastAsia="Times New Roman" w:hAnsi="Times New Roman" w:cs="Times New Roman"/>
           <w:noProof/>
         </w:rPr>
-        <w:pict w14:anchorId="798A3B6D">
-          <v:rect id="_x0000_i1032" alt="" style="width:431.95pt;height:.05pt;mso-width-percent:0;mso-height-percent:0;mso-width-percent:0;mso-height-percent:0" o:hrpct="923" o:hralign="center" o:hrstd="t" o:hr="t" fillcolor="#a0a0a0" stroked="f"/>
+        <w:pict w14:anchorId="637C6C60">
+          <v:rect id="_x0000_i1032" alt="" style="width:398.75pt;height:.05pt;mso-width-percent:0;mso-height-percent:0;mso-width-percent:0;mso-height-percent:0" o:hrpct="852" o:hralign="center" o:hrstd="t" o:hr="t" fillcolor="#a0a0a0" stroked="f"/>
         </w:pict>
       </w:r>
     </w:p>
@@ -1871,13 +1867,8 @@
         </w:rPr>
       </w:pPr>
       <w:r>
-        <w:rPr>
-          <w:noProof/>
-        </w:rPr>
-      </w:r>
-      <w:r>
-        <w:pict w14:anchorId="645C1533">
-          <v:rect id="Horizontal Line 8" o:spid="_x0000_s1032" style="width:6in;height:.1pt;visibility:visible;mso-wrap-style:square;mso-left-percent:-10001;mso-top-percent:-10001;mso-position-horizontal:absolute;mso-position-horizontal-relative:char;mso-position-vertical:absolute;mso-position-vertical-relative:line;mso-left-percent:-10001;mso-top-percent:-10001;v-text-anchor:top" o:gfxdata="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" filled="f">
+        <w:pict w14:anchorId="120924DB">
+          <v:rect id="Horizontal Line 8" o:spid="_x0000_s1032" alt="" style="width:6in;height:.1pt;visibility:visible;mso-wrap-style:square;mso-width-percent:0;mso-height-percent:0;mso-left-percent:-10001;mso-top-percent:-10001;mso-position-horizontal:absolute;mso-position-horizontal-relative:char;mso-position-vertical:absolute;mso-position-vertical-relative:line;mso-width-percent:0;mso-height-percent:0;mso-left-percent:-10001;mso-top-percent:-10001;v-text-anchor:top" filled="f">
             <o:lock v:ext="edit" rotation="t" aspectratio="t" verticies="t" text="t" shapetype="t"/>
             <w10:anchorlock/>
           </v:rect>
@@ -2150,13 +2141,8 @@
         </w:rPr>
       </w:pPr>
       <w:r>
-        <w:rPr>
-          <w:noProof/>
-        </w:rPr>
-      </w:r>
-      <w:r>
-        <w:pict w14:anchorId="777E6306">
-          <v:rect id="Horizontal Line 9" o:spid="_x0000_s1031" style="width:6in;height:.1pt;visibility:visible;mso-wrap-style:square;mso-left-percent:-10001;mso-top-percent:-10001;mso-position-horizontal:absolute;mso-position-horizontal-relative:char;mso-position-vertical:absolute;mso-position-vertical-relative:line;mso-left-percent:-10001;mso-top-percent:-10001;v-text-anchor:top" o:gfxdata="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" filled="f">
+        <w:pict w14:anchorId="6C95EDA2">
+          <v:rect id="Horizontal Line 9" o:spid="_x0000_s1031" alt="" style="width:6in;height:.1pt;visibility:visible;mso-wrap-style:square;mso-width-percent:0;mso-height-percent:0;mso-left-percent:-10001;mso-top-percent:-10001;mso-position-horizontal:absolute;mso-position-horizontal-relative:char;mso-position-vertical:absolute;mso-position-vertical-relative:line;mso-width-percent:0;mso-height-percent:0;mso-left-percent:-10001;mso-top-percent:-10001;v-text-anchor:top" filled="f">
             <o:lock v:ext="edit" rotation="t" aspectratio="t" verticies="t" text="t" shapetype="t"/>
             <w10:anchorlock/>
           </v:rect>
@@ -2424,13 +2410,8 @@
         </w:rPr>
       </w:pPr>
       <w:r>
-        <w:rPr>
-          <w:noProof/>
-        </w:rPr>
-      </w:r>
-      <w:r>
-        <w:pict w14:anchorId="218708A2">
-          <v:rect id="Horizontal Line 10" o:spid="_x0000_s1030" style="width:6in;height:.1pt;visibility:visible;mso-wrap-style:square;mso-left-percent:-10001;mso-top-percent:-10001;mso-position-horizontal:absolute;mso-position-horizontal-relative:char;mso-position-vertical:absolute;mso-position-vertical-relative:line;mso-left-percent:-10001;mso-top-percent:-10001;v-text-anchor:top" o:gfxdata="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" filled="f">
+        <w:pict w14:anchorId="4A967FA4">
+          <v:rect id="Horizontal Line 10" o:spid="_x0000_s1030" alt="" style="width:6in;height:.1pt;visibility:visible;mso-wrap-style:square;mso-width-percent:0;mso-height-percent:0;mso-left-percent:-10001;mso-top-percent:-10001;mso-position-horizontal:absolute;mso-position-horizontal-relative:char;mso-position-vertical:absolute;mso-position-vertical-relative:line;mso-width-percent:0;mso-height-percent:0;mso-left-percent:-10001;mso-top-percent:-10001;v-text-anchor:top" filled="f">
             <o:lock v:ext="edit" rotation="t" aspectratio="t" verticies="t" text="t" shapetype="t"/>
             <w10:anchorlock/>
           </v:rect>
@@ -2653,13 +2634,8 @@
         </w:rPr>
       </w:pPr>
       <w:r>
-        <w:rPr>
-          <w:noProof/>
-        </w:rPr>
-      </w:r>
-      <w:r>
-        <w:pict w14:anchorId="4FBD0398">
-          <v:rect id="Horizontal Line 11" o:spid="_x0000_s1029" style="width:6in;height:.1pt;visibility:visible;mso-wrap-style:square;mso-left-percent:-10001;mso-top-percent:-10001;mso-position-horizontal:absolute;mso-position-horizontal-relative:char;mso-position-vertical:absolute;mso-position-vertical-relative:line;mso-left-percent:-10001;mso-top-percent:-10001;v-text-anchor:top" o:gfxdata="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" filled="f">
+        <w:pict w14:anchorId="0EED78E0">
+          <v:rect id="Horizontal Line 11" o:spid="_x0000_s1029" alt="" style="width:6in;height:.1pt;visibility:visible;mso-wrap-style:square;mso-width-percent:0;mso-height-percent:0;mso-left-percent:-10001;mso-top-percent:-10001;mso-position-horizontal:absolute;mso-position-horizontal-relative:char;mso-position-vertical:absolute;mso-position-vertical-relative:line;mso-width-percent:0;mso-height-percent:0;mso-left-percent:-10001;mso-top-percent:-10001;v-text-anchor:top" filled="f">
             <o:lock v:ext="edit" rotation="t" aspectratio="t" verticies="t" text="t" shapetype="t"/>
             <w10:anchorlock/>
           </v:rect>
@@ -2867,13 +2843,8 @@
         </w:rPr>
       </w:pPr>
       <w:r>
-        <w:rPr>
-          <w:noProof/>
-        </w:rPr>
-      </w:r>
-      <w:r>
-        <w:pict w14:anchorId="39A67E8B">
-          <v:rect id="Horizontal Line 12" o:spid="_x0000_s1028" style="width:6in;height:.1pt;visibility:visible;mso-wrap-style:square;mso-left-percent:-10001;mso-top-percent:-10001;mso-position-horizontal:absolute;mso-position-horizontal-relative:char;mso-position-vertical:absolute;mso-position-vertical-relative:line;mso-left-percent:-10001;mso-top-percent:-10001;v-text-anchor:top" o:gfxdata="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" filled="f">
+        <w:pict w14:anchorId="171A2E02">
+          <v:rect id="Horizontal Line 12" o:spid="_x0000_s1028" alt="" style="width:6in;height:.1pt;visibility:visible;mso-wrap-style:square;mso-width-percent:0;mso-height-percent:0;mso-left-percent:-10001;mso-top-percent:-10001;mso-position-horizontal:absolute;mso-position-horizontal-relative:char;mso-position-vertical:absolute;mso-position-vertical-relative:line;mso-width-percent:0;mso-height-percent:0;mso-left-percent:-10001;mso-top-percent:-10001;v-text-anchor:top" filled="f">
             <o:lock v:ext="edit" rotation="t" aspectratio="t" verticies="t" text="t" shapetype="t"/>
             <w10:anchorlock/>
           </v:rect>
@@ -3063,13 +3034,8 @@
         </w:rPr>
       </w:pPr>
       <w:r>
-        <w:rPr>
-          <w:noProof/>
-        </w:rPr>
-      </w:r>
-      <w:r>
-        <w:pict w14:anchorId="6980640E">
-          <v:rect id="Horizontal Line 13" o:spid="_x0000_s1027" style="width:6in;height:.1pt;visibility:visible;mso-wrap-style:square;mso-left-percent:-10001;mso-top-percent:-10001;mso-position-horizontal:absolute;mso-position-horizontal-relative:char;mso-position-vertical:absolute;mso-position-vertical-relative:line;mso-left-percent:-10001;mso-top-percent:-10001;v-text-anchor:top" o:gfxdata="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" filled="f">
+        <w:pict w14:anchorId="735C56CF">
+          <v:rect id="Horizontal Line 13" o:spid="_x0000_s1027" alt="" style="width:6in;height:.1pt;visibility:visible;mso-wrap-style:square;mso-width-percent:0;mso-height-percent:0;mso-left-percent:-10001;mso-top-percent:-10001;mso-position-horizontal:absolute;mso-position-horizontal-relative:char;mso-position-vertical:absolute;mso-position-vertical-relative:line;mso-width-percent:0;mso-height-percent:0;mso-left-percent:-10001;mso-top-percent:-10001;v-text-anchor:top" filled="f">
             <o:lock v:ext="edit" rotation="t" aspectratio="t" verticies="t" text="t" shapetype="t"/>
             <w10:anchorlock/>
           </v:rect>
@@ -3310,13 +3276,8 @@
         </w:rPr>
       </w:pPr>
       <w:r>
-        <w:rPr>
-          <w:noProof/>
-        </w:rPr>
-      </w:r>
-      <w:r>
-        <w:pict w14:anchorId="165A681F">
-          <v:rect id="Horizontal Line 14" o:spid="_x0000_s1026" style="width:6in;height:.1pt;visibility:visible;mso-wrap-style:square;mso-left-percent:-10001;mso-top-percent:-10001;mso-position-horizontal:absolute;mso-position-horizontal-relative:char;mso-position-vertical:absolute;mso-position-vertical-relative:line;mso-left-percent:-10001;mso-top-percent:-10001;v-text-anchor:top" o:gfxdata="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" filled="f">
+        <w:pict w14:anchorId="1B7F18B1">
+          <v:rect id="Horizontal Line 14" o:spid="_x0000_s1026" alt="" style="width:6in;height:.1pt;visibility:visible;mso-wrap-style:square;mso-width-percent:0;mso-height-percent:0;mso-left-percent:-10001;mso-top-percent:-10001;mso-position-horizontal:absolute;mso-position-horizontal-relative:char;mso-position-vertical:absolute;mso-position-vertical-relative:line;mso-width-percent:0;mso-height-percent:0;mso-left-percent:-10001;mso-top-percent:-10001;v-text-anchor:top" filled="f">
             <o:lock v:ext="edit" rotation="t" aspectratio="t" verticies="t" text="t" shapetype="t"/>
             <w10:anchorlock/>
           </v:rect>
@@ -3492,19 +3453,43 @@
         <w:rPr>
           <w:rFonts w:ascii="Times New Roman" w:hAnsi="Times New Roman" w:cs="Times New Roman"/>
         </w:rPr>
-        <w:t>I ran the program countless time and live-tested algorithms and their behaviors, comparing their actual and expected behaviors. From this I found many movement bugs, especially with direction. Direction was tricky to implement correctly and I did not even fully do what I wanted (I wanted to make ghosts and fruits bounce off each other but time did not allow).</w:t>
+        <w:t xml:space="preserve">I ran the program countless time and live-tested algorithms and their behaviors, comparing their actual and expected behaviors. From this I found many movement bugs, especially with direction. Direction was tricky to implement correctly and I did not even fully do what I wanted (I wanted to make ghosts and fruits bounce off </w:t>
       </w:r>
       <w:r>
         <w:rPr>
           <w:rFonts w:ascii="Times New Roman" w:hAnsi="Times New Roman" w:cs="Times New Roman"/>
         </w:rPr>
+        <w:t>each other,</w:t>
+      </w:r>
+      <w:r>
+        <w:rPr>
+          <w:rFonts w:ascii="Times New Roman" w:hAnsi="Times New Roman" w:cs="Times New Roman"/>
+        </w:rPr>
+        <w:t xml:space="preserve"> but time did not allow).</w:t>
+      </w:r>
+      <w:r>
+        <w:rPr>
+          <w:rFonts w:ascii="Times New Roman" w:hAnsi="Times New Roman" w:cs="Times New Roman"/>
+        </w:rPr>
         <w:t xml:space="preserve"> </w:t>
       </w:r>
       <w:r>
         <w:rPr>
           <w:rFonts w:ascii="Times New Roman" w:hAnsi="Times New Roman" w:cs="Times New Roman"/>
         </w:rPr>
-        <w:t>Normal inputs involved dt to implement time based changes, as well as keyboard inputs to maneuver throughout the screen.</w:t>
+        <w:t xml:space="preserve">Normal inputs involved dt to implement </w:t>
+      </w:r>
+      <w:r>
+        <w:rPr>
+          <w:rFonts w:ascii="Times New Roman" w:hAnsi="Times New Roman" w:cs="Times New Roman"/>
+        </w:rPr>
+        <w:t>time-based</w:t>
+      </w:r>
+      <w:r>
+        <w:rPr>
+          <w:rFonts w:ascii="Times New Roman" w:hAnsi="Times New Roman" w:cs="Times New Roman"/>
+        </w:rPr>
+        <w:t xml:space="preserve"> changes, as well as keyboard inputs to maneuver throughout the screen.</w:t>
       </w:r>
       <w:r>
         <w:rPr>
@@ -3713,89 +3698,17 @@
     </w:p>
     <w:p>
       <w:pPr>
-        <w:pStyle w:val="ListParagraph"/>
-        <w:numPr>
-          <w:ilvl w:val="0"/>
-          <w:numId w:val="5"/>
-        </w:numPr>
+        <w:ind w:firstLine="360"/>
         <w:rPr>
           <w:rFonts w:ascii="Times New Roman" w:hAnsi="Times New Roman" w:cs="Times New Roman"/>
         </w:rPr>
       </w:pPr>
       <w:r>
-        <w:rPr>
-          <w:rFonts w:ascii="Times New Roman" w:hAnsi="Times New Roman" w:cs="Times New Roman"/>
-        </w:rPr>
-        <w:t>Describe the overall result of the assignment.</w:t>
-      </w:r>
-    </w:p>
-    <w:p>
-      <w:pPr>
-        <w:pStyle w:val="ListParagraph"/>
-        <w:numPr>
-          <w:ilvl w:val="0"/>
-          <w:numId w:val="5"/>
-        </w:numPr>
-        <w:rPr>
-          <w:rFonts w:ascii="Times New Roman" w:hAnsi="Times New Roman" w:cs="Times New Roman"/>
-        </w:rPr>
-      </w:pPr>
-      <w:r>
-        <w:rPr>
-          <w:rFonts w:ascii="Times New Roman" w:hAnsi="Times New Roman" w:cs="Times New Roman"/>
-        </w:rPr>
-        <w:t>Was the programming project a success?</w:t>
-      </w:r>
-    </w:p>
-    <w:p>
-      <w:pPr>
-        <w:pStyle w:val="ListParagraph"/>
-        <w:numPr>
-          <w:ilvl w:val="0"/>
-          <w:numId w:val="5"/>
-        </w:numPr>
-        <w:rPr>
-          <w:rFonts w:ascii="Times New Roman" w:hAnsi="Times New Roman" w:cs="Times New Roman"/>
-        </w:rPr>
-      </w:pPr>
-      <w:r>
-        <w:rPr>
-          <w:rFonts w:ascii="Times New Roman" w:hAnsi="Times New Roman" w:cs="Times New Roman"/>
-        </w:rPr>
-        <w:t xml:space="preserve">What would you do same or </w:t>
-      </w:r>
-      <w:r>
-        <w:rPr>
-          <w:rFonts w:ascii="Times New Roman" w:hAnsi="Times New Roman" w:cs="Times New Roman"/>
-        </w:rPr>
-        <w:t>differently next time?</w:t>
-      </w:r>
-    </w:p>
-    <w:p>
-      <w:pPr>
-        <w:pStyle w:val="ListParagraph"/>
-        <w:numPr>
-          <w:ilvl w:val="0"/>
-          <w:numId w:val="5"/>
-        </w:numPr>
-        <w:rPr>
-          <w:rFonts w:ascii="Times New Roman" w:hAnsi="Times New Roman" w:cs="Times New Roman"/>
-        </w:rPr>
-      </w:pPr>
-      <w:r>
-        <w:rPr>
-          <w:rFonts w:ascii="Times New Roman" w:hAnsi="Times New Roman" w:cs="Times New Roman"/>
-        </w:rPr>
-        <w:t>How long did the project take to complete?</w:t>
-      </w:r>
-    </w:p>
-    <w:p>
-      <w:pPr>
-        <w:ind w:left="360"/>
-        <w:rPr>
-          <w:rFonts w:ascii="Times New Roman" w:hAnsi="Times New Roman" w:cs="Times New Roman"/>
-        </w:rPr>
-      </w:pPr>
+        <w:t>The final result of this assignment is a fully interactive Pac-Man style game built using OpenGL and an MVC architecture. Pac-Man can be controlled using both keyboard and mouse input, food and ghosts move independently across the screen, and collision detection drives the game logic. The game includes a working power-up system, a hurt cooldown system, randomized ghost behavior, smooth animation, and a three-life system that ends the game when lives reach zero. Overall, the game behaves consistently and meets the functional and interaction requirements outlined in the assignment.</w:t>
+      </w:r>
+      <w:r>
+        <w:t xml:space="preserve"> This project took around 2 weeks to complete with daily work, if I were to do this again, I would spend more time developing obstacles like walls and a larger map with more things to do and interact with.</w:t>
+      </w:r>
     </w:p>
     <w:sectPr>
       <w:pgSz w:w="12240" w:h="15840"/>

</xml_diff>